<commit_message>
docs: fix stale backend-framework framing in PN Build Implementation Guide
The guide (written 2 June, before the Phase 0 freeze) still presented
Node/NestJS vs Go as an open choice. Phase 0 locked this to Node.js
Express v4 (ESM) on 22 June, ruling out both NestJS and Go explicitly.
Added a superseding note and fixed the decision table + checklist item
to point at PrivateNexus_Phase0_Freeze.md instead of re-presenting a
closed decision as open.
</commit_message>
<xml_diff>
--- a/docs/PrivateNexus_Build_Implementation_Guide_v1.0.docx
+++ b/docs/PrivateNexus_Build_Implementation_Guide_v1.0.docx
@@ -3637,7 +3637,7 @@
               <w:rPr>
                 <w:b w:val="0"/>
               </w:rPr>
-              <w:t>Node/NestJS or Go; choose one and stop bouncing</w:t>
+              <w:t>Node.js Express v4 (ESM) — LOCKED 22 June 2026. Go and NestJS were considered and explicitly ruled out. See PrivateNexus_Phase0_Freeze.md.</w:t>
             </w:r>
           </w:p>
         </w:tc>
@@ -3803,7 +3803,15 @@
         </w:tc>
       </w:tr>
     </w:tbl>
-    <w:p/>
+    <w:p>
+      <w:r>
+        <w:rPr>
+          <w:b/>
+          <w:i/>
+        </w:rPr>
+        <w:t>UPDATE (22 June 2026): Phase 0 is now LOCKED. See PrivateNexus_Phase0_Freeze.md for the authoritative, final decisions — it supersedes any "still choosing" language below. Do not reopen the backend framework choice.</w:t>
+      </w:r>
+    </w:p>
     <w:p>
       <w:pPr>
         <w:pStyle w:val="Heading2"/>
@@ -3817,7 +3825,7 @@
         <w:pStyle w:val="ListBullet"/>
       </w:pPr>
       <w:r>
-        <w:t>Choose backend framework and document the reason.</w:t>
+        <w:t>Backend framework is locked: Node.js Express v4 (ESM) — see PrivateNexus_Phase0_Freeze.md. Do not reopen (Go/NestJS explicitly ruled out).</w:t>
       </w:r>
     </w:p>
     <w:p>

</xml_diff>